<commit_message>
docs(STORY-00): add the sprint 1 team brief
Add docs/SPRINT-1.md, a plain-English brief for the whole team: machine
setup, the plan-first workflow, when to ask the PM, who waits for whom,
each person's part and how to test it, the on-site day and the sprint
calendar (26 Sep to 9 Oct 2026).

Move STORY-06 from James to Luke in the Sprint 1 plan, and give the
Supabase client factories to STORY-01 (as issue #50 already says), with
STORY-03 building proxy.ts on them.

Co-Authored-By: Claude <noreply@anthropic.com>
</commit_message>
<xml_diff>
--- a/docs/course/StudyHub_Sprint_1_Plan.docx
+++ b/docs/course/StudyHub_Sprint_1_Plan.docx
@@ -765,7 +765,7 @@
                 <w:b/>
                 <w:bCs/>
               </w:rPr>
-              <w:t xml:space="preserve">STORY-03</w:t>
+              <w:t xml:space="preserve">STORY-03 &amp; STORY-06</w:t>
             </w:r>
             <w:r>
               <w:t xml:space="preserve">: Authentication interfaces (</w:t>
@@ -804,7 +804,7 @@
               <w:t xml:space="preserve"> </w:t>
             </w:r>
             <w:r>
-              <w:t xml:space="preserve">session guard, with RLS as the security boundary.</w:t>
+              <w:t xml:space="preserve">session guard, with RLS as the security boundary; Vitest unit testing suite and Playwright smoke tests.</w:t>
             </w:r>
           </w:p>
         </w:tc>
@@ -851,7 +851,7 @@
                 <w:b/>
                 <w:bCs/>
               </w:rPr>
-              <w:t xml:space="preserve">STORY-04 &amp; STORY-06</w:t>
+              <w:t xml:space="preserve">STORY-04 &amp; STORY-05 (pages)</w:t>
             </w:r>
             <w:r>
               <w:t xml:space="preserve">: Authenticated Seeker dashboard layout (</w:t>
@@ -872,7 +872,7 @@
               <w:t xml:space="preserve">/host</w:t>
             </w:r>
             <w:r>
-              <w:t xml:space="preserve">), Vitest unit testing suite, Playwright smoke tests, DoD compliance verification.</w:t>
+              <w:t xml:space="preserve">) and space listing forms, DoD compliance verification.</w:t>
             </w:r>
           </w:p>
         </w:tc>
@@ -3176,6 +3176,39 @@
       </w:r>
       <w:r>
         <w:t xml:space="preserve">).</w:t>
+      </w:r>
+    </w:p>
+    <w:p>
+      <w:pPr>
+        <w:pStyle w:val="Compact"/>
+        <w:numPr>
+          <w:ilvl w:val="0"/>
+          <w:numId w:val="1010"/>
+        </w:numPr>
+      </w:pPr>
+      <w:r>
+        <w:t xml:space="preserve">Add the Supabase SSR client factories (</w:t>
+      </w:r>
+      <w:r>
+        <w:rPr>
+          <w:rStyle w:val="VerbatimChar"/>
+        </w:rPr>
+        <w:t xml:space="preserve">lib/supabase/client.ts</w:t>
+      </w:r>
+      <w:r>
+        <w:t xml:space="preserve">,</w:t>
+      </w:r>
+      <w:r>
+        <w:t xml:space="preserve"> </w:t>
+      </w:r>
+      <w:r>
+        <w:rPr>
+          <w:rStyle w:val="VerbatimChar"/>
+        </w:rPr>
+        <w:t xml:space="preserve">lib/supabase/server.ts</w:t>
+      </w:r>
+      <w:r>
+        <w:t xml:space="preserve">) that STORY-03, STORY-04 and STORY-05 build on.</w:t>
       </w:r>
     </w:p>
     <w:bookmarkEnd w:id="15"/>
@@ -4079,7 +4112,22 @@
         </w:numPr>
       </w:pPr>
       <w:r>
-        <w:t xml:space="preserve">Implement Supabase SSR client factories (</w:t>
+        <w:t xml:space="preserve">Build the session helper</w:t>
+      </w:r>
+      <w:r>
+        <w:t xml:space="preserve"> </w:t>
+      </w:r>
+      <w:r>
+        <w:rPr>
+          <w:rStyle w:val="VerbatimChar"/>
+        </w:rPr>
+        <w:t xml:space="preserve">lib/supabase/proxy.ts</w:t>
+      </w:r>
+      <w:r>
+        <w:t xml:space="preserve"> </w:t>
+      </w:r>
+      <w:r>
+        <w:t xml:space="preserve">on STORY-01’s client factories (</w:t>
       </w:r>
       <w:r>
         <w:rPr>
@@ -4098,18 +4146,6 @@
           <w:rStyle w:val="VerbatimChar"/>
         </w:rPr>
         <w:t xml:space="preserve">server.ts</w:t>
-      </w:r>
-      <w:r>
-        <w:t xml:space="preserve">,</w:t>
-      </w:r>
-      <w:r>
-        <w:t xml:space="preserve"> </w:t>
-      </w:r>
-      <w:r>
-        <w:rPr>
-          <w:rStyle w:val="VerbatimChar"/>
-        </w:rPr>
-        <w:t xml:space="preserve">proxy.ts</w:t>
       </w:r>
       <w:r>
         <w:t xml:space="preserve">).</w:t>
@@ -5582,7 +5618,7 @@
         <w:rPr>
           <w:rStyle w:val="VerbatimChar"/>
         </w:rPr>
-        <w:t xml:space="preserve">James Niño Mandawe</w:t>
+        <w:t xml:space="preserve">Luke Miguel Dongque</w:t>
       </w:r>
     </w:p>
     <w:p>
@@ -6479,7 +6515,7 @@
         <w:rPr>
           <w:rStyle w:val="VerbatimChar"/>
         </w:rPr>
-        <w:t xml:space="preserve">|                    | Assignee: James    |                          |                              |                    |</w:t>
+        <w:t xml:space="preserve">|                    | Assignee: Luke     |                          |                              |                    |</w:t>
       </w:r>
       <w:r>
         <w:br/>
@@ -7230,7 +7266,7 @@
               <w:pStyle w:val="Compact"/>
             </w:pPr>
             <w:r>
-              <w:t xml:space="preserve">James Niño Mandawe</w:t>
+              <w:t xml:space="preserve">Luke Miguel Dongque</w:t>
             </w:r>
           </w:p>
         </w:tc>

</xml_diff>

<commit_message>
docs(STORY-01): settle the profile and space fields
Record D-027: Sprint 1 profiles hold a name and phone number, and
spaces hold a name, description, address, one daily opening and
closing time, and a verification status. Study preferences and tags
move to STORY-08, price to STORY-08 and STORY-09, and an edit keeps a
verified space verified until STORY-14.

Apply it to the STORY-01 design (no open questions left), the Sprint 1
plan and its .docx, and the sprint brief. Email confirmation on the
cloud dev project is already off.

Co-Authored-By: Claude <noreply@anthropic.com>
</commit_message>
<xml_diff>
--- a/docs/course/StudyHub_Sprint_1_Plan.docx
+++ b/docs/course/StudyHub_Sprint_1_Plan.docx
@@ -293,7 +293,7 @@
         <w:t xml:space="preserve">User Profile CRUD</w:t>
       </w:r>
       <w:r>
-        <w:t xml:space="preserve">: View and edit user personal info, contact numbers, and preferences.</w:t>
+        <w:t xml:space="preserve">: View and edit their own name and contact number.</w:t>
       </w:r>
     </w:p>
     <w:p>
@@ -312,7 +312,7 @@
         <w:t xml:space="preserve">Host Space Listing CRUD</w:t>
       </w:r>
       <w:r>
-        <w:t xml:space="preserve">: Host creation, viewing, updating, and deletion of basic study hub/co-working venue details (name, location, description, operating hours, base hourly rate, and amenity tags).</w:t>
+        <w:t xml:space="preserve">: Host creation, viewing, updating, and deletion of basic study hub/co-working venue details (name, address, description, and daily opening and closing times).</w:t>
       </w:r>
     </w:p>
     <w:p>
@@ -1278,7 +1278,7 @@
               <w:pStyle w:val="Compact"/>
             </w:pPr>
             <w:r>
-              <w:t xml:space="preserve">Seekers and Hosts can read and update their own full name, phone number, and preferences.</w:t>
+              <w:t xml:space="preserve">Seekers and Hosts can read and update their own full name and phone number.</w:t>
             </w:r>
           </w:p>
         </w:tc>
@@ -1332,7 +1332,7 @@
               <w:pStyle w:val="Compact"/>
             </w:pPr>
             <w:r>
-              <w:t xml:space="preserve">Hosts can create, view, update, and delete basic study space listings (name, address, rate, hours, amenities).</w:t>
+              <w:t xml:space="preserve">Hosts can create, view, update, and delete basic study space listings (name, address, description, opening and closing times).</w:t>
             </w:r>
           </w:p>
         </w:tc>
@@ -1531,7 +1531,7 @@
               <w:pStyle w:val="Compact"/>
             </w:pPr>
             <w:r>
-              <w:t xml:space="preserve">Amenity Multi-Select Badges</w:t>
+              <w:t xml:space="preserve">Admin Console Shell</w:t>
             </w:r>
           </w:p>
         </w:tc>
@@ -1557,60 +1557,6 @@
               <w:pStyle w:val="Compact"/>
             </w:pPr>
             <w:r>
-              <w:t xml:space="preserve">Interactive toggles for Wi-Fi speed tier, power outlet accessibility, aircon, and quiet zone tags on space listings.</w:t>
-            </w:r>
-          </w:p>
-        </w:tc>
-      </w:tr>
-      <w:tr>
-        <w:tc>
-          <w:tcPr/>
-          <w:p>
-            <w:pPr>
-              <w:pStyle w:val="Compact"/>
-            </w:pPr>
-            <w:r>
-              <w:rPr>
-                <w:b/>
-                <w:bCs/>
-              </w:rPr>
-              <w:t xml:space="preserve">Could Have (C)</w:t>
-            </w:r>
-          </w:p>
-        </w:tc>
-        <w:tc>
-          <w:tcPr/>
-          <w:p>
-            <w:pPr>
-              <w:pStyle w:val="Compact"/>
-            </w:pPr>
-            <w:r>
-              <w:t xml:space="preserve">Admin Console Shell</w:t>
-            </w:r>
-          </w:p>
-        </w:tc>
-        <w:tc>
-          <w:tcPr/>
-          <w:p>
-            <w:pPr>
-              <w:pStyle w:val="Compact"/>
-            </w:pPr>
-            <w:r>
-              <w:rPr>
-                <w:b/>
-                <w:bCs/>
-              </w:rPr>
-              <w:t xml:space="preserve">Sprint 1</w:t>
-            </w:r>
-          </w:p>
-        </w:tc>
-        <w:tc>
-          <w:tcPr/>
-          <w:p>
-            <w:pPr>
-              <w:pStyle w:val="Compact"/>
-            </w:pPr>
-            <w:r>
               <w:t xml:space="preserve">Read-only administrative dashboard displaying registered user counts and database health metrics.</w:t>
             </w:r>
           </w:p>
@@ -1639,7 +1585,7 @@
               <w:pStyle w:val="Compact"/>
             </w:pPr>
             <w:r>
-              <w:t xml:space="preserve">Interactive Snap-Grid Seat Map Builder</w:t>
+              <w:t xml:space="preserve">Amenity Multi-Select Badges</w:t>
             </w:r>
           </w:p>
         </w:tc>
@@ -1665,7 +1611,7 @@
               <w:pStyle w:val="Compact"/>
             </w:pPr>
             <w:r>
-              <w:t xml:space="preserve">Visual canvas/grid for hosts to place desks, power sockets, and zones (deferred to Sprint 2).</w:t>
+              <w:t xml:space="preserve">Curated amenity tags (Wi-Fi tier, power outlets, aircon, quiet zone) arrive with STORY-08’s tag design (D-027).</w:t>
             </w:r>
           </w:p>
         </w:tc>
@@ -1693,7 +1639,7 @@
               <w:pStyle w:val="Compact"/>
             </w:pPr>
             <w:r>
-              <w:t xml:space="preserve">Live Geo-Search &amp; Interactive Map</w:t>
+              <w:t xml:space="preserve">Interactive Snap-Grid Seat Map Builder</w:t>
             </w:r>
           </w:p>
         </w:tc>
@@ -1719,7 +1665,7 @@
               <w:pStyle w:val="Compact"/>
             </w:pPr>
             <w:r>
-              <w:t xml:space="preserve">Leaflet/OpenStreetMap discovery with live distance calculation and amenity filtering (deferred to Sprint 2).</w:t>
+              <w:t xml:space="preserve">Visual canvas/grid for hosts to place desks, power sockets, and zones (deferred to Sprint 2).</w:t>
             </w:r>
           </w:p>
         </w:tc>
@@ -1747,7 +1693,7 @@
               <w:pStyle w:val="Compact"/>
             </w:pPr>
             <w:r>
-              <w:t xml:space="preserve">Image Storage &amp; Venue Photo Uploads</w:t>
+              <w:t xml:space="preserve">Live Geo-Search &amp; Interactive Map</w:t>
             </w:r>
           </w:p>
         </w:tc>
@@ -1773,7 +1719,7 @@
               <w:pStyle w:val="Compact"/>
             </w:pPr>
             <w:r>
-              <w:t xml:space="preserve">Supabase Storage bucket integration for space photography (deferred to Sprint 2).</w:t>
+              <w:t xml:space="preserve">Leaflet/OpenStreetMap discovery with live distance calculation and amenity filtering (deferred to Sprint 2).</w:t>
             </w:r>
           </w:p>
         </w:tc>
@@ -1801,6 +1747,60 @@
               <w:pStyle w:val="Compact"/>
             </w:pPr>
             <w:r>
+              <w:t xml:space="preserve">Image Storage &amp; Venue Photo Uploads</w:t>
+            </w:r>
+          </w:p>
+        </w:tc>
+        <w:tc>
+          <w:tcPr/>
+          <w:p>
+            <w:pPr>
+              <w:pStyle w:val="Compact"/>
+            </w:pPr>
+            <w:r>
+              <w:rPr>
+                <w:i/>
+                <w:iCs/>
+              </w:rPr>
+              <w:t xml:space="preserve">Sprint 2</w:t>
+            </w:r>
+          </w:p>
+        </w:tc>
+        <w:tc>
+          <w:tcPr/>
+          <w:p>
+            <w:pPr>
+              <w:pStyle w:val="Compact"/>
+            </w:pPr>
+            <w:r>
+              <w:t xml:space="preserve">Supabase Storage bucket integration for space photography (deferred to Sprint 2).</w:t>
+            </w:r>
+          </w:p>
+        </w:tc>
+      </w:tr>
+      <w:tr>
+        <w:tc>
+          <w:tcPr/>
+          <w:p>
+            <w:pPr>
+              <w:pStyle w:val="Compact"/>
+            </w:pPr>
+            <w:r>
+              <w:rPr>
+                <w:b/>
+                <w:bCs/>
+              </w:rPr>
+              <w:t xml:space="preserve">Won’t Have (W)</w:t>
+            </w:r>
+          </w:p>
+        </w:tc>
+        <w:tc>
+          <w:tcPr/>
+          <w:p>
+            <w:pPr>
+              <w:pStyle w:val="Compact"/>
+            </w:pPr>
+            <w:r>
               <w:t xml:space="preserve">Reserve-Now Seat Holds &amp; Timed Locks</w:t>
             </w:r>
           </w:p>
@@ -2977,37 +2977,28 @@
         <w:rPr>
           <w:rStyle w:val="VerbatimChar"/>
         </w:rPr>
-        <w:t xml:space="preserve">hourly_rate</w:t>
-      </w:r>
-      <w:r>
-        <w:t xml:space="preserve">,</w:t>
-      </w:r>
-      <w:r>
-        <w:t xml:space="preserve"> </w:t>
-      </w:r>
-      <w:r>
-        <w:rPr>
-          <w:rStyle w:val="VerbatimChar"/>
-        </w:rPr>
-        <w:t xml:space="preserve">operating_hours</w:t>
-      </w:r>
-      <w:r>
-        <w:t xml:space="preserve">,</w:t>
-      </w:r>
-      <w:r>
-        <w:t xml:space="preserve"> </w:t>
-      </w:r>
-      <w:r>
-        <w:rPr>
-          <w:rStyle w:val="VerbatimChar"/>
-        </w:rPr>
-        <w:t xml:space="preserve">amenities</w:t>
-      </w:r>
-      <w:r>
-        <w:t xml:space="preserve"> </w:t>
-      </w:r>
-      <w:r>
-        <w:t xml:space="preserve">(text array),</w:t>
+        <w:t xml:space="preserve">opens_at</w:t>
+      </w:r>
+      <w:r>
+        <w:t xml:space="preserve"> </w:t>
+      </w:r>
+      <w:r>
+        <w:t xml:space="preserve">and</w:t>
+      </w:r>
+      <w:r>
+        <w:t xml:space="preserve"> </w:t>
+      </w:r>
+      <w:r>
+        <w:rPr>
+          <w:rStyle w:val="VerbatimChar"/>
+        </w:rPr>
+        <w:t xml:space="preserve">closes_at</w:t>
+      </w:r>
+      <w:r>
+        <w:t xml:space="preserve"> </w:t>
+      </w:r>
+      <w:r>
+        <w:t xml:space="preserve">(the same hours every day),</w:t>
       </w:r>
       <w:r>
         <w:t xml:space="preserve"> </w:t>
@@ -3019,7 +3010,10 @@
         <w:t xml:space="preserve">status</w:t>
       </w:r>
       <w:r>
-        <w:t xml:space="preserve">, and timestamps.</w:t>
+        <w:t xml:space="preserve"> </w:t>
+      </w:r>
+      <w:r>
+        <w:t xml:space="preserve">(verification), and timestamps (D-027).</w:t>
       </w:r>
     </w:p>
     <w:p>
@@ -3049,7 +3043,7 @@
         <w:t xml:space="preserve">profiles</w:t>
       </w:r>
       <w:r>
-        <w:t xml:space="preserve">: Public select, self-update only, admin full oversight.</w:t>
+        <w:t xml:space="preserve">: each user reads their own row and updates only their name and phone number, never their role; Administrators read all rows; everyone else gets 0 rows.</w:t>
       </w:r>
     </w:p>
     <w:p>
@@ -3067,10 +3061,7 @@
         <w:t xml:space="preserve">spaces</w:t>
       </w:r>
       <w:r>
-        <w:t xml:space="preserve">: Public select for active spaces, host insert/update/delete restricted to</w:t>
-      </w:r>
-      <w:r>
-        <w:t xml:space="preserve"> </w:t>
+        <w:t xml:space="preserve">: everyone reads verified spaces; a host reads, inserts, updates and deletes only their own (</w:t>
       </w:r>
       <w:r>
         <w:rPr>
@@ -3079,7 +3070,7 @@
         <w:t xml:space="preserve">host_id = auth.uid()</w:t>
       </w:r>
       <w:r>
-        <w:t xml:space="preserve">.</w:t>
+        <w:t xml:space="preserve">), never the verification status; Administrators read all.</w:t>
       </w:r>
     </w:p>
     <w:p>
@@ -4654,7 +4645,7 @@
           <w:i/>
           <w:iCs/>
         </w:rPr>
-        <w:t xml:space="preserve">As a Seeker, I want to access my personal dashboard and view/update my profile details, so that my account information and contact preferences remain accurate.</w:t>
+        <w:t xml:space="preserve">As a Seeker, I want to access my personal dashboard and view/update my profile details, so that my account information and contact details remain accurate.</w:t>
       </w:r>
     </w:p>
     <w:p>
@@ -4884,7 +4875,10 @@
         <w:t xml:space="preserve">full_name</w:t>
       </w:r>
       <w:r>
-        <w:t xml:space="preserve">,</w:t>
+        <w:t xml:space="preserve"> </w:t>
+      </w:r>
+      <w:r>
+        <w:t xml:space="preserve">and</w:t>
       </w:r>
       <w:r>
         <w:t xml:space="preserve"> </w:t>
@@ -4896,7 +4890,10 @@
         <w:t xml:space="preserve">phone_number</w:t>
       </w:r>
       <w:r>
-        <w:t xml:space="preserve">, and study preference tags.</w:t>
+        <w:t xml:space="preserve"> </w:t>
+      </w:r>
+      <w:r>
+        <w:t xml:space="preserve">(study preferences move to STORY-08, D-027).</w:t>
       </w:r>
     </w:p>
     <w:p>
@@ -5318,25 +5315,16 @@
         </w:numPr>
       </w:pPr>
       <w:r>
-        <w:t xml:space="preserve">Operating Hours (</w:t>
-      </w:r>
-      <w:r>
-        <w:rPr>
-          <w:rStyle w:val="VerbatimChar"/>
-        </w:rPr>
-        <w:t xml:space="preserve">text</w:t>
-      </w:r>
-      <w:r>
-        <w:t xml:space="preserve">, e.g.,</w:t>
-      </w:r>
-      <w:r>
-        <w:t xml:space="preserve"> </w:t>
-      </w:r>
-      <w:r>
-        <w:t xml:space="preserve">“7:00 AM - 11:00 PM”</w:t>
-      </w:r>
-      <w:r>
-        <w:t xml:space="preserve">).</w:t>
+        <w:t xml:space="preserve">Opening and Closing Time (</w:t>
+      </w:r>
+      <w:r>
+        <w:rPr>
+          <w:rStyle w:val="VerbatimChar"/>
+        </w:rPr>
+        <w:t xml:space="preserve">time</w:t>
+      </w:r>
+      <w:r>
+        <w:t xml:space="preserve">, required; a closing time earlier than the opening time means after midnight, and equal times mean open 24 hours).</w:t>
       </w:r>
     </w:p>
     <w:p>
@@ -5348,28 +5336,7 @@
         </w:numPr>
       </w:pPr>
       <w:r>
-        <w:t xml:space="preserve">Base Hourly Rate (</w:t>
-      </w:r>
-      <w:r>
-        <w:rPr>
-          <w:rStyle w:val="VerbatimChar"/>
-        </w:rPr>
-        <w:t xml:space="preserve">numeric</w:t>
-      </w:r>
-      <w:r>
-        <w:t xml:space="preserve">, PHP).</w:t>
-      </w:r>
-    </w:p>
-    <w:p>
-      <w:pPr>
-        <w:pStyle w:val="Compact"/>
-        <w:numPr>
-          <w:ilvl w:val="1"/>
-          <w:numId w:val="1034"/>
-        </w:numPr>
-      </w:pPr>
-      <w:r>
-        <w:t xml:space="preserve">Amenity Checkbox Tags (High-Speed Wi-Fi, Dedicated Outlets, Air Conditioning, Quiet Zone).</w:t>
+        <w:t xml:space="preserve">No price or amenity tags in Sprint 1: tags arrive with STORY-08 and the reservation fee with STORY-09 (D-027).</w:t>
       </w:r>
     </w:p>
     <w:p>
@@ -5463,7 +5430,7 @@
         </w:numPr>
       </w:pPr>
       <w:r>
-        <w:t xml:space="preserve">Host can update the name, rate, or amenities of their own listing.</w:t>
+        <w:t xml:space="preserve">Host can update the name, address, or hours of their own listing.</w:t>
       </w:r>
     </w:p>
     <w:p>
@@ -5902,7 +5869,7 @@
         </w:numPr>
       </w:pPr>
       <w:r>
-        <w:t xml:space="preserve">Write validation tests for Space Listing schema (ensuring positive rates, non-empty titles).</w:t>
+        <w:t xml:space="preserve">Write validation tests for Space Listing schema (required name and address, valid opening and closing times).</w:t>
       </w:r>
     </w:p>
     <w:p>

</xml_diff>

<commit_message>
docs(STORY-02): bring the design in line with the repo docs
- Complete the tokens: computed contrast for every pair, the ring, input
  and border values, and the destructive pair base-nova actually renders.
- Say how the generated components reach 48 px targets and opaque focus.
- Put the header and footer in app/(public)/_components, and say which
  file renders <main>.
- Add the footer disclaimers and the landing copy rules (D-002, D-005,
  D-026).
- Record token-only colors and light mode only as D-031.
- Match the Sprint 1 plan's STORY-02 tasks to the design, and regenerate
  its .docx.
- Leave the signed-in header to STORY-03's design, and say so in the
  brief.
- Drop the references to the author's local draft and old checkout, and
  unlink the AI execution plan from the design index.

Co-Authored-By: Claude <noreply@anthropic.com>
</commit_message>
<xml_diff>
--- a/docs/course/StudyHub_Sprint_1_Plan.docx
+++ b/docs/course/StudyHub_Sprint_1_Plan.docx
@@ -3620,7 +3620,7 @@
         </w:numPr>
       </w:pPr>
       <w:r>
-        <w:t xml:space="preserve">Build responsive public navigation header with dynamic login/register state.</w:t>
+        <w:t xml:space="preserve">Build responsive public navigation header with Log in and Sign up links. Whether it shows a signed-in state is left to STORY-03’s design, which owns the session.</w:t>
       </w:r>
     </w:p>
     <w:p>
@@ -3641,7 +3641,7 @@
         <w:t xml:space="preserve">/</w:t>
       </w:r>
       <w:r>
-        <w:t xml:space="preserve">) showcasing StudyHub’s 3 core value pillars:</w:t>
+        <w:t xml:space="preserve">) describing StudyHub’s 3 core value pillars in words, each marked with the sprint that delivers it, with no sample inventory or working-looking controls:</w:t>
       </w:r>
     </w:p>
     <w:p>
@@ -3657,13 +3657,13 @@
           <w:i/>
           <w:iCs/>
         </w:rPr>
-        <w:t xml:space="preserve">Live Snap-Grid Map</w:t>
-      </w:r>
-      <w:r>
-        <w:t xml:space="preserve"> </w:t>
-      </w:r>
-      <w:r>
-        <w:t xml:space="preserve">(interactive seat view preview).</w:t>
+        <w:t xml:space="preserve">Snap-Grid Seat Map</w:t>
+      </w:r>
+      <w:r>
+        <w:t xml:space="preserve"> </w:t>
+      </w:r>
+      <w:r>
+        <w:t xml:space="preserve">(pick an exact seat; Sprint 2).</w:t>
       </w:r>
     </w:p>
     <w:p>
@@ -3685,7 +3685,7 @@
         <w:t xml:space="preserve"> </w:t>
       </w:r>
       <w:r>
-        <w:t xml:space="preserve">(Wi-Fi tiers, power outlets, quiet zones).</w:t>
+        <w:t xml:space="preserve">(Wi-Fi tiers, power outlets, quiet zones; Sprint 2).</w:t>
       </w:r>
     </w:p>
     <w:p>
@@ -3707,7 +3707,7 @@
         <w:t xml:space="preserve"> </w:t>
       </w:r>
       <w:r>
-        <w:t xml:space="preserve">(guaranteed seat upon arrival).</w:t>
+        <w:t xml:space="preserve">(guaranteed seat upon arrival; Sprint 3).</w:t>
       </w:r>
     </w:p>
     <w:p>

</xml_diff>